<commit_message>
Templates: arenda s organizaciej, parties relabeled
Co-Authored-By: Claude Opus 5.5 <noreply@anthropic.com>
Claude-Session: https://claude.ai/code/session_01NC3hd9uZLzTu99QHMfc3Fm
</commit_message>
<xml_diff>
--- a/docs/2026-11-dogovor-arendy/akt-priema-peredachi-kvartiry.docx
+++ b/docs/2026-11-dogovor-arendy/akt-priema-peredachi-kvartiry.docx
@@ -29,7 +29,7 @@
           <w:sz w:val="20"/>
           <w:szCs w:val="20"/>
         </w:rPr>
-        <w:t xml:space="preserve">Приложение № 1 к договору найма жилого помещения от «___» ________ 20___ г.</w:t>
+        <w:t xml:space="preserve">Приложение № 1 к договору найма (аренды) жилого помещения от «___» ________ 20___ г.</w:t>
       </w:r>
     </w:p>
     <w:p>
@@ -61,7 +61,7 @@
           <w:sz w:val="21"/>
           <w:szCs w:val="21"/>
         </w:rPr>
-        <w:t xml:space="preserve">Акт составлен при:  ☐ передаче Квартиры Нанимателю    ☐ возврате Квартиры Наймодателю</w:t>
+        <w:t xml:space="preserve">Акт составлен при:  ☐ передаче Квартиры жильцу (арендатору)    ☐ возврате Квартиры собственнику</w:t>
       </w:r>
     </w:p>
     <w:p>
@@ -91,7 +91,7 @@
           <w:sz w:val="21"/>
           <w:szCs w:val="21"/>
         </w:rPr>
-        <w:t xml:space="preserve">Наймодатель: </w:t>
+        <w:t xml:space="preserve">Собственник (наймодатель / арендодатель): </w:t>
       </w:r>
       <w:r>
         <w:rPr>
@@ -115,7 +115,7 @@
           <w:sz w:val="21"/>
           <w:szCs w:val="21"/>
         </w:rPr>
-        <w:t xml:space="preserve">Наниматель: </w:t>
+        <w:t xml:space="preserve">Жилец или компания (наниматель / арендатор): </w:t>
       </w:r>
       <w:r>
         <w:rPr>

</xml_diff>